<commit_message>
Move chart legends outside plot areas
</commit_message>
<xml_diff>
--- a/FINAL_REPORT.docx
+++ b/FINAL_REPORT.docx
@@ -4664,7 +4664,7 @@
       <w:r>
         <w:drawing>
           <wp:inline xmlns:a="http://schemas.openxmlformats.org/drawingml/2006/main" xmlns:pic="http://schemas.openxmlformats.org/drawingml/2006/picture">
-            <wp:extent cx="5394960" cy="2247900"/>
+            <wp:extent cx="5394960" cy="2335884"/>
             <wp:docPr id="1" name="Picture 1"/>
             <wp:cNvGraphicFramePr>
               <a:graphicFrameLocks noChangeAspect="1"/>
@@ -4685,7 +4685,7 @@
                   <pic:spPr>
                     <a:xfrm>
                       <a:off x="0" y="0"/>
-                      <a:ext cx="5394960" cy="2247900"/>
+                      <a:ext cx="5394960" cy="2335884"/>
                     </a:xfrm>
                     <a:prstGeom prst="rect"/>
                   </pic:spPr>
@@ -4733,7 +4733,7 @@
       <w:r>
         <w:drawing>
           <wp:inline xmlns:a="http://schemas.openxmlformats.org/drawingml/2006/main" xmlns:pic="http://schemas.openxmlformats.org/drawingml/2006/picture">
-            <wp:extent cx="5212080" cy="3040380"/>
+            <wp:extent cx="5212080" cy="2834164"/>
             <wp:docPr id="2" name="Picture 2"/>
             <wp:cNvGraphicFramePr>
               <a:graphicFrameLocks noChangeAspect="1"/>
@@ -4754,7 +4754,7 @@
                   <pic:spPr>
                     <a:xfrm>
                       <a:off x="0" y="0"/>
-                      <a:ext cx="5212080" cy="3040380"/>
+                      <a:ext cx="5212080" cy="2834164"/>
                     </a:xfrm>
                     <a:prstGeom prst="rect"/>
                   </pic:spPr>
@@ -4802,7 +4802,7 @@
       <w:r>
         <w:drawing>
           <wp:inline xmlns:a="http://schemas.openxmlformats.org/drawingml/2006/main" xmlns:pic="http://schemas.openxmlformats.org/drawingml/2006/picture">
-            <wp:extent cx="5212080" cy="3040380"/>
+            <wp:extent cx="5212080" cy="2834164"/>
             <wp:docPr id="3" name="Picture 3"/>
             <wp:cNvGraphicFramePr>
               <a:graphicFrameLocks noChangeAspect="1"/>
@@ -4823,7 +4823,7 @@
                   <pic:spPr>
                     <a:xfrm>
                       <a:off x="0" y="0"/>
-                      <a:ext cx="5212080" cy="3040380"/>
+                      <a:ext cx="5212080" cy="2834164"/>
                     </a:xfrm>
                     <a:prstGeom prst="rect"/>
                   </pic:spPr>

</xml_diff>